<commit_message>
Italian Part 2: episodes 21-23, ep26 showroom link, combined Part 2 book PDF
Also record Part 2 fixed facts in the story bible and mark episodes done in PLAN.

Co-Authored-By: Claude Opus 5.5 <noreply@anthropic.com>
Claude-Session: https://claude.ai/code/session_014Pwa4fJotSRvNewqVrvk7U
</commit_message>
<xml_diff>
--- a/business_it/part2/ep26_Litigio_in_autostrada.docx
+++ b/business_it/part2/ep26_Litigio_in_autostrada.docx
@@ -554,7 +554,7 @@
           <w:sz w:val="22"/>
         </w:rPr>
         <w:tab/>
-        <w:t>Allora parliamo di strategia, così il tempo passa. Galbiati ha ventidue marchi nel suo showroom. Se ci prende, siamo in vetrina davanti a tutti i buyer di Milano.</w:t>
+        <w:t>Allora parliamo di strategia, così il tempo passa. Ottavio Brambilla, quello di Brera, ha lo showroom pieno e ci ha mandati dal suo amico Galbiati. Galbiati ha ventidue marchi. Se ci prende, siamo in vetrina davanti a tutti i buyer di Milano.</w:t>
       </w:r>
     </w:p>
     <w:p>
@@ -8174,7 +8174,7 @@
           <w:sz w:val="21"/>
         </w:rPr>
         <w:tab/>
-        <w:t>그럼 전략 얘기나 하자, 시간도 갈 겸. 갈비아티 쇼룸엔 브랜드가 스물두 개 있어. 우리를 받아 주면 밀라노 바이어들 앞에서 진열되는 거야.</w:t>
+        <w:t>그럼 전략 얘기나 하자, 시간도 갈 겸. 브레라에서 만난 오타비오 브람빌라 씨는 쇼룸이 꽉 차서 친구 갈비아티한테 우리를 보냈어. 갈비아티 쇼룸엔 브랜드가 스물두 개 있어. 우리를 받아 주면 밀라노 바이어들 앞에서 진열되는 거야.</w:t>
       </w:r>
     </w:p>
     <w:p>

</xml_diff>